<commit_message>
Update Phase 2 strength training plan and web dashboard
</commit_message>
<xml_diff>
--- a/docs/weekly/2026-W32_第32週肌力訓練計畫.docx
+++ b/docs/weekly/2026-W32_第32週肌力訓練計畫.docx
@@ -52,7 +52,7 @@
           <w:color w:val="C00000"/>
           <w:sz w:val="22"/>
         </w:rPr>
-        <w:t>72.9%</w:t>
+        <w:t>79.5%</w:t>
       </w:r>
       <w:r>
         <w:rPr>
@@ -515,7 +515,7 @@
                 <w:color w:val="000000"/>
                 <w:sz w:val="19"/>
               </w:rPr>
-              <w:t>5.50 小時</w:t>
+              <w:t>9.00 小時</w:t>
             </w:r>
           </w:p>
         </w:tc>
@@ -542,7 +542,7 @@
                 <w:color w:val="000000"/>
                 <w:sz w:val="19"/>
               </w:rPr>
-              <w:t>4.07 小時</w:t>
+              <w:t>7.38 小時</w:t>
             </w:r>
           </w:p>
         </w:tc>
@@ -569,7 +569,7 @@
                 <w:color w:val="000000"/>
                 <w:sz w:val="19"/>
               </w:rPr>
-              <w:t>73.9%</w:t>
+              <w:t>82.0%</w:t>
             </w:r>
           </w:p>
         </w:tc>
@@ -623,7 +623,7 @@
                 <w:color w:val="000000"/>
                 <w:sz w:val="19"/>
               </w:rPr>
-              <w:t>108.84 km</w:t>
+              <w:t>198.08 km</w:t>
             </w:r>
           </w:p>
         </w:tc>
@@ -706,7 +706,7 @@
                 <w:color w:val="000000"/>
                 <w:sz w:val="19"/>
               </w:rPr>
-              <w:t>4.00 小時</w:t>
+              <w:t>5.33 小時</w:t>
             </w:r>
           </w:p>
         </w:tc>
@@ -733,7 +733,7 @@
                 <w:color w:val="000000"/>
                 <w:sz w:val="19"/>
               </w:rPr>
-              <w:t>2.28 小時</w:t>
+              <w:t>3.60 小時</w:t>
             </w:r>
           </w:p>
         </w:tc>
@@ -760,7 +760,7 @@
                 <w:color w:val="000000"/>
                 <w:sz w:val="19"/>
               </w:rPr>
-              <w:t>57.1%</w:t>
+              <w:t>67.5%</w:t>
             </w:r>
           </w:p>
         </w:tc>
@@ -787,7 +787,7 @@
                 <w:color w:val="000000"/>
                 <w:sz w:val="19"/>
               </w:rPr>
-              <w:t>39.96 km</w:t>
+              <w:t>53.96 km</w:t>
             </w:r>
           </w:p>
         </w:tc>
@@ -814,7 +814,7 @@
                 <w:color w:val="000000"/>
                 <w:sz w:val="19"/>
               </w:rPr>
-              <w:t>20.84 km</w:t>
+              <w:t>32.37 km</w:t>
             </w:r>
           </w:p>
         </w:tc>
@@ -841,7 +841,7 @@
                 <w:color w:val="000000"/>
                 <w:sz w:val="19"/>
               </w:rPr>
-              <w:t>52.2%</w:t>
+              <w:t>60.0%</w:t>
             </w:r>
           </w:p>
         </w:tc>
@@ -1069,7 +1069,7 @@
           <w:color w:val="000000"/>
           <w:sz w:val="22"/>
         </w:rPr>
-        <w:t>2. 單車狀況：上週單車共完成 3 次（累計 108.84 km / 4.07 小時），達計劃時間之 73.9%。有氧耐力與瓦數輸出保持穩定。</w:t>
+        <w:t>2. 單車狀況：上週單車共完成 4 次（累計 198.08 km / 7.38 小時），達計劃時間之 82.0%。有氧耐力與瓦數輸出保持穩定。</w:t>
         <w:br/>
       </w:r>
       <w:r>
@@ -1079,7 +1079,7 @@
           <w:color w:val="000000"/>
           <w:sz w:val="22"/>
         </w:rPr>
-        <w:t>3. 跑步狀況：上週跑步共完成 4 次（累計 20.84 km / 2.28 小時），達計劃時間之 57.1%。轉換跑與長跑步頻節奏保持良好，請繼續維持肌肉衝擊適應。</w:t>
+        <w:t>3. 跑步狀況：上週跑步共完成 5 次（累計 32.37 km / 3.60 小時），達計劃時間之 67.5%。轉換跑與長跑步頻節奏保持良好，請繼續維持肌肉衝擊適應。</w:t>
         <w:br/>
       </w:r>
       <w:r>
@@ -2874,7 +2874,7 @@
           <w:color w:val="000000"/>
           <w:sz w:val="22"/>
         </w:rPr>
-        <w:t>• 近 4 週動態指標：滾動平均週跑量 21.14 km、週騎量 75.03 km、週游量 7.56 km (整體執行率 64.7%)</w:t>
+        <w:t>• 近 4 週動態指標：滾動平均週跑量 24.13 km、週騎量 98.16 km、週游量 7.56 km (整體執行率 67.6%)</w:t>
         <w:br/>
       </w:r>
       <w:r>
@@ -2914,7 +2914,7 @@
           <w:color w:val="000000"/>
           <w:sz w:val="22"/>
         </w:rPr>
-        <w:t xml:space="preserve">  - Alan Couzens / Joe Friel 功率能耗模型: FTP 205W (目標 140W-145W) | 單車 05:45 | 馬拉松 04:25</w:t>
+        <w:t xml:space="preserve">  - Alan Couzens / Joe Friel 功率能耗模型: FTP 205W (目標 140W-145W) | 單車 05:45 | 馬拉松 04:22</w:t>
         <w:br/>
       </w:r>
       <w:r>
@@ -2934,7 +2934,7 @@
           <w:color w:val="385623"/>
           <w:sz w:val="22"/>
         </w:rPr>
-        <w:t xml:space="preserve">  - 樂觀目標 (高峰發揮 / 全場未抽筋)：11:19 – 11:34 (預估中位數 11:26)</w:t>
+        <w:t xml:space="preserve">  - 樂觀目標 (高峰發揮 / 全場未抽筋)：11:17 – 11:32 (預估中位數 11:24)</w:t>
         <w:br/>
       </w:r>
       <w:r>
@@ -2944,7 +2944,7 @@
           <w:color w:val="C55A11"/>
           <w:sz w:val="22"/>
         </w:rPr>
-        <w:t xml:space="preserve">  - 中性目標 (穩定完賽 / 體力適當分配)：11:30 – 11:54 (預估中位數 11:42)</w:t>
+        <w:t xml:space="preserve">  - 中性目標 (穩定完賽 / 體力適當分配)：11:24 – 11:48 (預估中位數 11:36)</w:t>
         <w:br/>
       </w:r>
       <w:r>
@@ -2954,7 +2954,7 @@
           <w:color w:val="C00000"/>
           <w:sz w:val="22"/>
         </w:rPr>
-        <w:t xml:space="preserve">  - 保守目標 (後半程馬拉松掉速/抽筋)：11:45 – 12:20 (預估中位數 12:00)</w:t>
+        <w:t xml:space="preserve">  - 保守目標 (後半程馬拉松掉速/抽筋)：11:35 – 12:10 (預估中位數 11:50)</w:t>
         <w:br/>
       </w:r>
     </w:p>
@@ -3124,7 +3124,7 @@
                 <w:color w:val="000000"/>
                 <w:sz w:val="19"/>
               </w:rPr>
-              <w:t>休息： Day Off＋休息： Base 3-1 Day Off</w:t>
+              <w:t>休息： Day Off＋休息： Base 3-1 Day Off＋Run: Running</w:t>
             </w:r>
           </w:p>
         </w:tc>
@@ -3209,7 +3209,7 @@
                 <w:color w:val="000000"/>
                 <w:sz w:val="19"/>
               </w:rPr>
-              <w:t>Run: Running</w:t>
+              <w:t>Run: Running＋Run: Running＋Bike: Cycling＋Swim: 甜甜課表</w:t>
             </w:r>
           </w:p>
         </w:tc>
@@ -3236,7 +3236,7 @@
                 <w:color w:val="000000"/>
                 <w:sz w:val="19"/>
               </w:rPr>
-              <w:t>不排肌力；專注完成 TP 主課。</w:t>
+              <w:t>短課 15–20 分鐘；游泳後 30–60 分鐘或晚間完成。</w:t>
             </w:r>
           </w:p>
         </w:tc>
@@ -3294,7 +3294,7 @@
                 <w:color w:val="000000"/>
                 <w:sz w:val="19"/>
               </w:rPr>
-              <w:t>Swim: 甜甜課表</w:t>
+              <w:t>Swim: 甜甜課表＋Bike: TEMPO 9'30 X 8</w:t>
             </w:r>
           </w:p>
         </w:tc>
@@ -3491,7 +3491,7 @@
                 <w:color w:val="000000"/>
                 <w:sz w:val="19"/>
               </w:rPr>
-              <w:t>短課 15–20 分鐘；游泳後 30–60 分鐘或晚間完成。</w:t>
+              <w:t>不排肌力；專注完成 TP 主課。</w:t>
             </w:r>
           </w:p>
         </w:tc>
@@ -3549,7 +3549,7 @@
                 <w:color w:val="000000"/>
                 <w:sz w:val="19"/>
               </w:rPr>
-              <w:t>Bike: LSD 4.5＋Run: 轉換75分</w:t>
+              <w:t>Bike: LSD 4.5＋Run: 轉換75分＋Bike: 3</w:t>
             </w:r>
           </w:p>
         </w:tc>
@@ -3634,7 +3634,7 @@
                 <w:color w:val="000000"/>
                 <w:sz w:val="19"/>
               </w:rPr>
-              <w:t>Run: 福和橋～河濱～明德宮（補水則返）＋Swim: 4200</w:t>
+              <w:t>Run: 福和橋～河濱～明德宮（補水則返）＋Swim: 4200＋Bike: 5</w:t>
             </w:r>
           </w:p>
         </w:tc>
@@ -3672,7 +3672,7 @@
         <w:pStyle w:val="Heading1"/>
       </w:pPr>
       <w:r>
-        <w:t>四、 肌力訓練動作內容</w:t>
+        <w:t>四、 肌力訓練動作內容 (第二階段：力量進階與單腿爆發期 (Weeks 31–34))</w:t>
       </w:r>
     </w:p>
     <w:p>
@@ -3680,7 +3680,7 @@
         <w:pStyle w:val="Heading2"/>
       </w:pPr>
       <w:r>
-        <w:t>主課 B (週一與週四執行)</w:t>
+        <w:t>主課 B (週一與週四執行 - 第二階段：力量進階與單腿爆發期)</w:t>
       </w:r>
     </w:p>
     <w:tbl>
@@ -3775,7 +3775,7 @@
                 <w:color w:val="000000"/>
                 <w:sz w:val="21"/>
               </w:rPr>
-              <w:t>臀推或橋式 (Hip Thrust)</w:t>
+              <w:t>單腿臀推 (Single-leg Hip Thrust)</w:t>
             </w:r>
           </w:p>
         </w:tc>
@@ -3801,7 +3801,7 @@
                 <w:color w:val="000000"/>
                 <w:sz w:val="21"/>
               </w:rPr>
-              <w:t>3 組 × 8–10 下 (活化並強化臀大肌)</w:t>
+              <w:t>3 組 × 8–10 下／邊 (活化臀大肌單側獨立輸出)</w:t>
             </w:r>
           </w:p>
         </w:tc>
@@ -3829,7 +3829,7 @@
                 <w:color w:val="000000"/>
                 <w:sz w:val="21"/>
               </w:rPr>
-              <w:t>登階 (Step-up)</w:t>
+              <w:t>負重登階加提膝 (Weighted Step-up w/ Knee Drive)</w:t>
             </w:r>
           </w:p>
         </w:tc>
@@ -3855,7 +3855,7 @@
                 <w:color w:val="000000"/>
                 <w:sz w:val="21"/>
               </w:rPr>
-              <w:t>3 組 × 6–8 下／邊 (模仿跑步推蹬與單腳穩定)</w:t>
+              <w:t>3 組 × 6–8 下／邊 (完全模擬跑步推蹬與擺腿機制)</w:t>
             </w:r>
           </w:p>
         </w:tc>
@@ -3883,7 +3883,7 @@
                 <w:color w:val="000000"/>
                 <w:sz w:val="21"/>
               </w:rPr>
-              <w:t>帕羅夫壓 (Pallof press)</w:t>
+              <w:t>壺鈴搖擺 (Kettlebell Swing)</w:t>
             </w:r>
           </w:p>
         </w:tc>
@@ -3909,7 +3909,7 @@
                 <w:color w:val="000000"/>
                 <w:sz w:val="21"/>
               </w:rPr>
-              <w:t>2 組 × 10–12 下／邊 (核心抗旋轉能力)</w:t>
+              <w:t>3 組 × 12–15 下 (訓練髖關節快速伸展爆發力)</w:t>
             </w:r>
           </w:p>
         </w:tc>
@@ -3937,7 +3937,7 @@
                 <w:color w:val="000000"/>
                 <w:sz w:val="21"/>
               </w:rPr>
-              <w:t>怪獸走 (Monster Walk)</w:t>
+              <w:t>站姿帕羅夫壓帶轉體 (Pallof Press w/ Rotation)</w:t>
             </w:r>
           </w:p>
         </w:tc>
@@ -3963,7 +3963,7 @@
                 <w:color w:val="000000"/>
                 <w:sz w:val="21"/>
               </w:rPr>
-              <w:t>2 組 × 10–15 步／邊 (激活臀中肌，防止膝外翻)</w:t>
+              <w:t>2 組 × 10 下／邊 (動態抗旋轉與軀幹穩定)</w:t>
             </w:r>
           </w:p>
         </w:tc>
@@ -3991,7 +3991,7 @@
                 <w:color w:val="000000"/>
                 <w:sz w:val="21"/>
               </w:rPr>
-              <w:t>離心提踵 (Eccentric Calf)</w:t>
+              <w:t>懸吊/滾輪核心抗伸展 (Ab Wheel Rollout)</w:t>
             </w:r>
           </w:p>
         </w:tc>
@@ -4017,7 +4017,7 @@
                 <w:color w:val="000000"/>
                 <w:sz w:val="21"/>
               </w:rPr>
-              <w:t>3 組 × 8–12 下 (預防跟腱炎，加強推蹬剛性)</w:t>
+              <w:t>2 組 × 8–10 下 (強化前側腹直肌與深層核心)</w:t>
             </w:r>
           </w:p>
         </w:tc>
@@ -4045,7 +4045,7 @@
                 <w:color w:val="000000"/>
                 <w:sz w:val="21"/>
               </w:rPr>
-              <w:t>髖屈肌伸展 (Hip Flexor Stretch)</w:t>
+              <w:t>站姿彈力帶提膝 (Band Hip Flexor Drive)</w:t>
             </w:r>
           </w:p>
         </w:tc>
@@ -4071,7 +4071,7 @@
                 <w:color w:val="000000"/>
                 <w:sz w:val="21"/>
               </w:rPr>
-              <w:t>2 組 × 30 秒／邊 (舒緩久坐與騎車的緊繃)</w:t>
+              <w:t>2 組 × 12 下／邊 (強化長跑擺腿抗疲勞能力)</w:t>
             </w:r>
           </w:p>
         </w:tc>
@@ -4177,7 +4177,7 @@
                 <w:color w:val="000000"/>
                 <w:sz w:val="21"/>
               </w:rPr>
-              <w:t>死蟲式 (Dead bug)</w:t>
+              <w:t>滾輪核心抗伸展 (Ab Wheel Rollout)</w:t>
             </w:r>
           </w:p>
         </w:tc>
@@ -4203,7 +4203,7 @@
                 <w:color w:val="000000"/>
                 <w:sz w:val="21"/>
               </w:rPr>
-              <w:t>2 組 × 8–10 下／邊</w:t>
+              <w:t>2 組 × 8 下</w:t>
             </w:r>
           </w:p>
         </w:tc>
@@ -4231,7 +4231,7 @@
                 <w:color w:val="000000"/>
                 <w:sz w:val="21"/>
               </w:rPr>
-              <w:t>側棒式 (Side Plank)</w:t>
+              <w:t>側棒式轉體 (Side Plank Threading)</w:t>
             </w:r>
           </w:p>
         </w:tc>
@@ -4257,7 +4257,7 @@
                 <w:color w:val="000000"/>
                 <w:sz w:val="21"/>
               </w:rPr>
-              <w:t>2 組 × 30 秒／邊</w:t>
+              <w:t>2 組 × 8 下／邊</w:t>
             </w:r>
           </w:p>
         </w:tc>
@@ -4285,7 +4285,7 @@
                 <w:color w:val="000000"/>
                 <w:sz w:val="21"/>
               </w:rPr>
-              <w:t>鳥狗式 (Bird dog)</w:t>
+              <w:t>單腿硬舉靜態支撐 (Single Leg RDL Hold)</w:t>
             </w:r>
           </w:p>
         </w:tc>
@@ -4311,7 +4311,7 @@
                 <w:color w:val="000000"/>
                 <w:sz w:val="21"/>
               </w:rPr>
-              <w:t>2 組 × 8 下／邊 (強化對側核心控制)</w:t>
+              <w:t>2 組 × 20 秒／邊</w:t>
             </w:r>
           </w:p>
         </w:tc>
@@ -4339,7 +4339,7 @@
                 <w:color w:val="000000"/>
                 <w:sz w:val="21"/>
               </w:rPr>
-              <w:t>彈力帶側走 (Band Walk)</w:t>
+              <w:t>彈力帶怪獸走+深蹲 (Band Walk to Squat)</w:t>
             </w:r>
           </w:p>
         </w:tc>
@@ -4365,7 +4365,7 @@
                 <w:color w:val="000000"/>
                 <w:sz w:val="21"/>
               </w:rPr>
-              <w:t>2 組 × 10–15 步／邊</w:t>
+              <w:t>2 組 × 12 步</w:t>
             </w:r>
           </w:p>
         </w:tc>
@@ -4393,7 +4393,7 @@
                 <w:color w:val="000000"/>
                 <w:sz w:val="21"/>
               </w:rPr>
-              <w:t>單腳提踵 (Single Calf Raise)</w:t>
+              <w:t>負重單腳提踵 (Weighted Single Calf Raise)</w:t>
             </w:r>
           </w:p>
         </w:tc>
@@ -4419,7 +4419,7 @@
                 <w:color w:val="000000"/>
                 <w:sz w:val="21"/>
               </w:rPr>
-              <w:t>2 組 × 12–15 下／邊</w:t>
+              <w:t>2 組 × 10–12 下／邊</w:t>
             </w:r>
           </w:p>
         </w:tc>

</xml_diff>